<commit_message>
changes after copying files
</commit_message>
<xml_diff>
--- a/project/Project proposal vers 2.docx
+++ b/project/Project proposal vers 2.docx
@@ -450,7 +450,18 @@
                 <w:szCs w:val="22"/>
                 <w:lang w:val="en-US" w:eastAsia="en-US" w:bidi="ar-SA"/>
               </w:rPr>
-              <w:t>Square body as three discs, on a circle then a second shape</w:t>
+              <w:t>Plank</w:t>
+            </w:r>
+            <w:r>
+              <w:rPr>
+                <w:rFonts w:eastAsia="ＭＳ 明朝" w:cs=""/>
+                <w:b w:val="false"/>
+                <w:kern w:val="0"/>
+                <w:sz w:val="20"/>
+                <w:szCs w:val="22"/>
+                <w:lang w:val="en-US" w:eastAsia="en-US" w:bidi="ar-SA"/>
+              </w:rPr>
+              <w:t xml:space="preserve"> body as three discs, on a circle then a second shape</w:t>
             </w:r>
           </w:p>
         </w:tc>
@@ -3355,6 +3366,29 @@
     </w:pPr>
     <w:rPr/>
   </w:style>
+  <w:style w:type="paragraph" w:styleId="TableContents">
+    <w:name w:val="Table Contents"/>
+    <w:basedOn w:val="Normal"/>
+    <w:qFormat/>
+    <w:pPr>
+      <w:widowControl w:val="false"/>
+      <w:suppressLineNumbers/>
+    </w:pPr>
+    <w:rPr/>
+  </w:style>
+  <w:style w:type="paragraph" w:styleId="TableHeading">
+    <w:name w:val="Table Heading"/>
+    <w:basedOn w:val="TableContents"/>
+    <w:qFormat/>
+    <w:pPr>
+      <w:suppressLineNumbers/>
+      <w:jc w:val="center"/>
+    </w:pPr>
+    <w:rPr>
+      <w:b/>
+      <w:bCs/>
+    </w:rPr>
+  </w:style>
   <w:style w:type="numbering" w:styleId="NoList" w:default="1">
     <w:name w:val="No List"/>
     <w:uiPriority w:val="99"/>

</xml_diff>